<commit_message>
add project scrrenshots in step 6 project submission file
</commit_message>
<xml_diff>
--- a/Step6_code_submission_file_deepika.docx
+++ b/Step6_code_submission_file_deepika.docx
@@ -29,6 +29,39 @@
           <w:b/>
           <w:bCs/>
         </w:rPr>
+        <w:t xml:space="preserve">Github repository for source code - </w:t>
+      </w:r>
+      <w:hyperlink r:id="rId5" w:history="1">
+        <w:r>
+          <w:rPr>
+            <w:rStyle w:val="Hyperlink"/>
+            <w:b/>
+            <w:bCs/>
+          </w:rPr>
+          <w:t>https://github.com/gourideepika/icloudems-assignment</w:t>
+        </w:r>
+      </w:hyperlink>
+    </w:p>
+    <w:p>
+      <w:pPr>
+        <w:rPr>
+          <w:b/>
+          <w:bCs/>
+        </w:rPr>
+      </w:pPr>
+    </w:p>
+    <w:p>
+      <w:pPr>
+        <w:rPr>
+          <w:b/>
+          <w:bCs/>
+        </w:rPr>
+      </w:pPr>
+      <w:r>
+        <w:rPr>
+          <w:b/>
+          <w:bCs/>
+        </w:rPr>
         <w:t>1. Table Creation Queries</w:t>
       </w:r>
     </w:p>
@@ -47,25 +80,7 @@
         <w:rPr>
           <w:u w:val="single"/>
         </w:rPr>
-        <w:t>d</w:t>
-      </w:r>
-      <w:r>
-        <w:rPr>
-          <w:u w:val="single"/>
-        </w:rPr>
-        <w:t>atabase</w:t>
-      </w:r>
-      <w:r>
-        <w:rPr>
-          <w:u w:val="single"/>
-        </w:rPr>
-        <w:t>/</w:t>
-      </w:r>
-      <w:r>
-        <w:rPr>
-          <w:u w:val="single"/>
-        </w:rPr>
-        <w:t>migrations</w:t>
+        <w:t>database/migrations</w:t>
       </w:r>
     </w:p>
     <w:p>
@@ -130,7 +145,7 @@
     <w:p>
       <w:r>
         <w:pict w14:anchorId="2CA901E8">
-          <v:rect id="_x0000_i1061" style="width:0;height:1.5pt" o:hralign="center" o:hrstd="t" o:hr="t" fillcolor="#a0a0a0" stroked="f"/>
+          <v:rect id="_x0000_i1025" style="width:0;height:1.5pt" o:hralign="center" o:hrstd="t" o:hr="t" fillcolor="#a0a0a0" stroked="f"/>
         </w:pict>
       </w:r>
     </w:p>
@@ -176,15 +191,7 @@
     </w:p>
     <w:p>
       <w:r>
-        <w:t xml:space="preserve">4. The job opens the CSV file using PHP’s </w:t>
-      </w:r>
-      <w:proofErr w:type="gramStart"/>
-      <w:r>
-        <w:t>fgetcsv(</w:t>
-      </w:r>
-      <w:proofErr w:type="gramEnd"/>
-      <w:r>
-        <w:t>) function.</w:t>
+        <w:t>4. The job opens the CSV file using PHP’s fgetcsv() function.</w:t>
       </w:r>
     </w:p>
     <w:p>
@@ -204,6 +211,7 @@
     </w:p>
     <w:p>
       <w:r>
+        <w:lastRenderedPageBreak/>
         <w:t>8. CSV values are validated and converted into appropriate data types such as integers, dates, strings, and decimal amounts.</w:t>
       </w:r>
     </w:p>
@@ -214,99 +222,257 @@
     </w:p>
     <w:p>
       <w:r>
+        <w:t>10. Records are collected in batches of 1,000 rows.</w:t>
+      </w:r>
+    </w:p>
+    <w:p>
+      <w:r>
+        <w:t>11. Each batch is inserted using Laravel’s bulk insert() method to improve performance.</w:t>
+      </w:r>
+    </w:p>
+    <w:p>
+      <w:r>
+        <w:t>12. Import progress is tracked using processed_records.</w:t>
+      </w:r>
+    </w:p>
+    <w:p>
+      <w:r>
+        <w:t>13. The total number of imported records is stored in total_records.</w:t>
+      </w:r>
+    </w:p>
+    <w:p>
+      <w:r>
+        <w:t>14. Empty CSV rows are ignored.</w:t>
+      </w:r>
+    </w:p>
+    <w:p>
+      <w:r>
+        <w:t>15. The import is limited to a maximum of 200,000 data rows.</w:t>
+      </w:r>
+    </w:p>
+    <w:p>
+      <w:r>
+        <w:t>16. After staging insertion is completed, the job processes due ledger data and performs validation.</w:t>
+      </w:r>
+    </w:p>
+    <w:p>
+      <w:r>
+        <w:t>17. The entire import, processing, and validation workflow runs inside a database transaction.</w:t>
+      </w:r>
+    </w:p>
+    <w:p>
+      <w:r>
+        <w:t xml:space="preserve">18. </w:t>
+      </w:r>
+      <w:r>
+        <w:t>The complete process of uploading and inserting 2 lakh records takes approximately 5–6 minutes</w:t>
+      </w:r>
+      <w:r>
+        <w:t>.</w:t>
+      </w:r>
+    </w:p>
+    <w:p>
+      <w:r>
+        <w:t xml:space="preserve">19. </w:t>
+      </w:r>
+      <w:r>
+        <w:t>All project setup steps, configuration details, required commands, and other setup instructions are provided step-by-step in the README.md file.</w:t>
+      </w:r>
+    </w:p>
+    <w:p/>
+    <w:p>
+      <w:r>
+        <w:t xml:space="preserve">Implemented in: </w:t>
+      </w:r>
+      <w:r>
+        <w:rPr>
+          <w:u w:val="single"/>
+        </w:rPr>
+        <w:t>app/Jobs/ImportLedgerJob.php</w:t>
+      </w:r>
+    </w:p>
+    <w:p>
+      <w:r>
+        <w:t xml:space="preserve">Queue job dispatching is handled in: </w:t>
+      </w:r>
+      <w:r>
+        <w:rPr>
+          <w:u w:val="single"/>
+        </w:rPr>
+        <w:t>app/Http/Controllers/ImportController.php</w:t>
+      </w:r>
+    </w:p>
+    <w:p>
+      <w:r>
+        <w:pict w14:anchorId="6ABAEE01">
+          <v:rect id="_x0000_i1026" style="width:0;height:1.5pt" o:hralign="center" o:hrstd="t" o:hr="t" fillcolor="#a0a0a0" stroked="f"/>
+        </w:pict>
+      </w:r>
+    </w:p>
+    <w:p>
+      <w:pPr>
+        <w:rPr>
+          <w:b/>
+          <w:bCs/>
+        </w:rPr>
+      </w:pPr>
+      <w:r>
+        <w:rPr>
+          <w:b/>
+          <w:bCs/>
+        </w:rPr>
+        <w:t>3. Due Data Extraction Queries</w:t>
+      </w:r>
+    </w:p>
+    <w:p>
+      <w:r>
+        <w:t>Due Data is extracted from the staging table where due_amount is not zero.</w:t>
+      </w:r>
+    </w:p>
+    <w:p>
+      <w:r>
+        <w:t>SELECT *</w:t>
+      </w:r>
+      <w:r>
+        <w:t xml:space="preserve"> </w:t>
+      </w:r>
+      <w:r>
+        <w:t>FROM staging_ledgers</w:t>
+      </w:r>
+      <w:r>
+        <w:t xml:space="preserve"> </w:t>
+      </w:r>
+      <w:r>
+        <w:t>WHERE due_amount &lt;&gt; 0;</w:t>
+      </w:r>
+    </w:p>
+    <w:p>
+      <w:r>
+        <w:pict w14:anchorId="20499C91">
+          <v:rect id="_x0000_i1027" style="width:0;height:1.5pt" o:hralign="center" o:hrstd="t" o:hr="t" fillcolor="#a0a0a0" stroked="f"/>
+        </w:pict>
+      </w:r>
+    </w:p>
+    <w:p>
+      <w:pPr>
+        <w:rPr>
+          <w:b/>
+          <w:bCs/>
+        </w:rPr>
+      </w:pPr>
+      <w:r>
+        <w:rPr>
+          <w:b/>
+          <w:bCs/>
+        </w:rPr>
+        <w:t>4. Financial Transaction Insertion Logic</w:t>
+      </w:r>
+    </w:p>
+    <w:p>
+      <w:r>
+        <w:t>For each unique due transaction, one record is created in the financial_transactions table.</w:t>
+      </w:r>
+    </w:p>
+    <w:p>
+      <w:r>
+        <w:t>The transaction amount is calculated from the Due Amount of the related staging records.</w:t>
+      </w:r>
+    </w:p>
+    <w:p>
+      <w:r>
         <w:lastRenderedPageBreak/>
-        <w:t>10. Records are collected in batches of 1,000 rows.</w:t>
-      </w:r>
-    </w:p>
-    <w:p>
-      <w:r>
-        <w:t xml:space="preserve">11. Each batch is inserted using Laravel’s bulk </w:t>
-      </w:r>
-      <w:proofErr w:type="gramStart"/>
-      <w:r>
-        <w:t>insert(</w:t>
-      </w:r>
-      <w:proofErr w:type="gramEnd"/>
-      <w:r>
-        <w:t>) method to improve performance.</w:t>
-      </w:r>
-    </w:p>
-    <w:p>
-      <w:r>
-        <w:t>12. Import progress is tracked using processed_records.</w:t>
-      </w:r>
-    </w:p>
-    <w:p>
-      <w:r>
-        <w:t>13. The total number of imported records is stored in total_records.</w:t>
-      </w:r>
-    </w:p>
-    <w:p>
-      <w:r>
-        <w:t>14. Empty CSV rows are ignored.</w:t>
-      </w:r>
-    </w:p>
-    <w:p>
-      <w:r>
-        <w:t>15. The import is limited to a maximum of 200,000 data rows.</w:t>
-      </w:r>
-    </w:p>
-    <w:p>
-      <w:r>
-        <w:t>16. After staging insertion is completed, the job processes due ledger data and performs validation.</w:t>
-      </w:r>
-    </w:p>
-    <w:p>
-      <w:r>
-        <w:t>17. The entire import, processing, and validation workflow runs inside a database transaction.</w:t>
-      </w:r>
-    </w:p>
-    <w:p>
-      <w:r>
-        <w:t xml:space="preserve">18. </w:t>
-      </w:r>
-      <w:r>
-        <w:t>The complete process of uploading and inserting 2 lakh records takes approximately 5–6 minutes</w:t>
-      </w:r>
-      <w:r>
-        <w:t>.</w:t>
-      </w:r>
-    </w:p>
-    <w:p>
-      <w:r>
-        <w:t xml:space="preserve">19. </w:t>
-      </w:r>
-      <w:r>
-        <w:t>All project setup steps, configuration details, required commands, and other setup instructions are provided step-by-step in the README.md file.</w:t>
+        <w:t>The Financial Transaction insertion logic is implemented in:</w:t>
+      </w:r>
+    </w:p>
+    <w:p>
+      <w:pPr>
+        <w:rPr>
+          <w:u w:val="single"/>
+        </w:rPr>
+      </w:pPr>
+      <w:r>
+        <w:rPr>
+          <w:u w:val="single"/>
+        </w:rPr>
+        <w:t>app/Jobs/ImportLedgerJob.php</w:t>
+      </w:r>
+    </w:p>
+    <w:p>
+      <w:r>
+        <w:t>The parent transaction is created before inserting its related detail records.</w:t>
+      </w:r>
+    </w:p>
+    <w:p>
+      <w:r>
+        <w:pict w14:anchorId="43083859">
+          <v:rect id="_x0000_i1028" style="width:0;height:1.5pt" o:hralign="center" o:hrstd="t" o:hr="t" fillcolor="#a0a0a0" stroked="f"/>
+        </w:pict>
+      </w:r>
+    </w:p>
+    <w:p>
+      <w:pPr>
+        <w:rPr>
+          <w:b/>
+          <w:bCs/>
+        </w:rPr>
+      </w:pPr>
+      <w:r>
+        <w:rPr>
+          <w:b/>
+          <w:bCs/>
+        </w:rPr>
+        <w:t>5. Financial Transaction Detail Insertion Logic</w:t>
+      </w:r>
+    </w:p>
+    <w:p>
+      <w:r>
+        <w:t>For every fee-head line belonging to a due transaction, one record is created in the financial_transaction_details table.</w:t>
+      </w:r>
+    </w:p>
+    <w:p>
+      <w:r>
+        <w:t>Each detail record is linked to its parent Financial Transaction using:</w:t>
+      </w:r>
+    </w:p>
+    <w:p>
+      <w:r>
+        <w:t>financial_transaction_details.financial_tran_id</w:t>
+      </w:r>
+      <w:r>
+        <w:t xml:space="preserve"> -&gt;</w:t>
+      </w:r>
+      <w:r>
+        <w:t>financial_transactions.id</w:t>
       </w:r>
     </w:p>
     <w:p/>
     <w:p>
       <w:r>
-        <w:t xml:space="preserve">Implemented in: </w:t>
-      </w:r>
-      <w:r>
+        <w:t>The Financial Transaction Detail insertion logic is implemented in:</w:t>
+      </w:r>
+    </w:p>
+    <w:p>
+      <w:pPr>
         <w:rPr>
           <w:u w:val="single"/>
         </w:rPr>
+      </w:pPr>
+      <w:r>
+        <w:rPr>
+          <w:u w:val="single"/>
+        </w:rPr>
         <w:t>app/Jobs/ImportLedgerJob.php</w:t>
       </w:r>
     </w:p>
     <w:p>
       <w:r>
-        <w:t xml:space="preserve">Queue job dispatching is handled in: </w:t>
-      </w:r>
-      <w:r>
-        <w:rPr>
-          <w:u w:val="single"/>
-        </w:rPr>
-        <w:t>app/Http/Controllers/ImportController.php</w:t>
-      </w:r>
-    </w:p>
-    <w:p>
-      <w:r>
-        <w:pict w14:anchorId="6ABAEE01">
-          <v:rect id="_x0000_i1062" style="width:0;height:1.5pt" o:hralign="center" o:hrstd="t" o:hr="t" fillcolor="#a0a0a0" stroked="f"/>
+        <w:t>A database transaction is used so that if the parent or any related detail insertion fails, the transaction can be rolled back.</w:t>
+      </w:r>
+    </w:p>
+    <w:p>
+      <w:r>
+        <w:pict w14:anchorId="2D6687B9">
+          <v:rect id="_x0000_i1029" style="width:0;height:1.5pt" o:hralign="center" o:hrstd="t" o:hr="t" fillcolor="#a0a0a0" stroked="f"/>
         </w:pict>
       </w:r>
     </w:p>
@@ -322,17 +488,56 @@
           <w:b/>
           <w:bCs/>
         </w:rPr>
-        <w:t>3. Due Data Extraction Queries</w:t>
-      </w:r>
-    </w:p>
-    <w:p>
-      <w:r>
-        <w:t>Due Data is extracted from the staging table where due_amount is not zero.</w:t>
-      </w:r>
-    </w:p>
-    <w:p>
-      <w:r>
-        <w:t>SELECT *</w:t>
+        <w:t>6. Amount and Count Validation Queries</w:t>
+      </w:r>
+    </w:p>
+    <w:p>
+      <w:pPr>
+        <w:rPr>
+          <w:b/>
+          <w:bCs/>
+        </w:rPr>
+      </w:pPr>
+      <w:r>
+        <w:rPr>
+          <w:b/>
+          <w:bCs/>
+        </w:rPr>
+        <w:t>Amount Match</w:t>
+      </w:r>
+    </w:p>
+    <w:p>
+      <w:r>
+        <w:t>The total Due Amount in the source file equals the total amount in Financial Transaction, which equals the total amount across Financial Transaction Detail.</w:t>
+      </w:r>
+    </w:p>
+    <w:p>
+      <w:pPr>
+        <w:rPr>
+          <w:b/>
+          <w:bCs/>
+        </w:rPr>
+      </w:pPr>
+      <w:r>
+        <w:rPr>
+          <w:b/>
+          <w:bCs/>
+        </w:rPr>
+        <w:t>1. Total Due Amount</w:t>
+      </w:r>
+    </w:p>
+    <w:p>
+      <w:r>
+        <w:rPr>
+          <w:b/>
+          <w:bCs/>
+        </w:rPr>
+        <w:t>Query:</w:t>
+      </w:r>
+    </w:p>
+    <w:p>
+      <w:r>
+        <w:t>SELECT SUM(due_amount) AS source_due_amount</w:t>
       </w:r>
       <w:r>
         <w:t xml:space="preserve"> </w:t>
@@ -344,763 +549,758 @@
         <w:t xml:space="preserve"> </w:t>
       </w:r>
       <w:r>
+        <w:t>WHERE due_amount</w:t>
+      </w:r>
+      <w:r>
+        <w:t xml:space="preserve"> </w:t>
+      </w:r>
+      <w:r>
+        <w:t>&lt;&gt; 0;</w:t>
+      </w:r>
+    </w:p>
+    <w:p>
+      <w:r>
+        <w:rPr>
+          <w:b/>
+          <w:bCs/>
+        </w:rPr>
+        <w:t>Result:</w:t>
+      </w:r>
+    </w:p>
+    <w:p>
+      <w:r>
+        <w:t>source_due_amount = 2872660911.00</w:t>
+      </w:r>
+    </w:p>
+    <w:p>
+      <w:pPr>
+        <w:rPr>
+          <w:b/>
+          <w:bCs/>
+        </w:rPr>
+      </w:pPr>
+      <w:r>
+        <w:rPr>
+          <w:b/>
+          <w:bCs/>
+        </w:rPr>
+        <w:t>2. Total Amount from Financial Transaction</w:t>
+      </w:r>
+    </w:p>
+    <w:p>
+      <w:r>
+        <w:rPr>
+          <w:b/>
+          <w:bCs/>
+        </w:rPr>
+        <w:t>Query:</w:t>
+      </w:r>
+    </w:p>
+    <w:p>
+      <w:r>
+        <w:lastRenderedPageBreak/>
+        <w:t>SELECT SUM(amount) AS financial_transaction_amount</w:t>
+      </w:r>
+      <w:r>
+        <w:t xml:space="preserve"> </w:t>
+      </w:r>
+      <w:r>
+        <w:t>FROM financial_transactions;</w:t>
+      </w:r>
+    </w:p>
+    <w:p>
+      <w:r>
+        <w:rPr>
+          <w:b/>
+          <w:bCs/>
+        </w:rPr>
+        <w:t>Result:</w:t>
+      </w:r>
+    </w:p>
+    <w:p>
+      <w:r>
+        <w:t>financial_transaction_amount = 2872660911.00</w:t>
+      </w:r>
+    </w:p>
+    <w:p>
+      <w:pPr>
+        <w:rPr>
+          <w:b/>
+          <w:bCs/>
+        </w:rPr>
+      </w:pPr>
+      <w:r>
+        <w:rPr>
+          <w:b/>
+          <w:bCs/>
+        </w:rPr>
+        <w:t>3. Total Amount from Financial Transaction Detail</w:t>
+      </w:r>
+    </w:p>
+    <w:p>
+      <w:r>
+        <w:rPr>
+          <w:b/>
+          <w:bCs/>
+        </w:rPr>
+        <w:t>Query:</w:t>
+      </w:r>
+    </w:p>
+    <w:p>
+      <w:r>
+        <w:t>SELECT SUM(amount) AS financial_transaction_detail_amount</w:t>
+      </w:r>
+      <w:r>
+        <w:t xml:space="preserve"> </w:t>
+      </w:r>
+      <w:r>
+        <w:t>FROM</w:t>
+      </w:r>
+      <w:r>
+        <w:t xml:space="preserve"> </w:t>
+      </w:r>
+      <w:r>
+        <w:t>financial_transaction_details;</w:t>
+      </w:r>
+    </w:p>
+    <w:p>
+      <w:r>
+        <w:rPr>
+          <w:b/>
+          <w:bCs/>
+        </w:rPr>
+        <w:t>Result:</w:t>
+      </w:r>
+    </w:p>
+    <w:p>
+      <w:r>
+        <w:t>financial_transaction_detail_amount = 2872660911.00</w:t>
+      </w:r>
+    </w:p>
+    <w:p>
+      <w:pPr>
+        <w:rPr>
+          <w:b/>
+          <w:bCs/>
+        </w:rPr>
+      </w:pPr>
+      <w:r>
+        <w:rPr>
+          <w:b/>
+          <w:bCs/>
+        </w:rPr>
+        <w:t>AMOUNT MATCH - PASS</w:t>
+      </w:r>
+    </w:p>
+    <w:p>
+      <w:r>
+        <w:t>Source Due Amount                  2,872,660,911.00</w:t>
+      </w:r>
+    </w:p>
+    <w:p>
+      <w:r>
+        <w:t>Financial Transaction Amount       2,872,660,911.00</w:t>
+      </w:r>
+    </w:p>
+    <w:p>
+      <w:r>
+        <w:t>Financial Transaction Detail       2,872,660,911.00</w:t>
+      </w:r>
+    </w:p>
+    <w:p>
+      <w:r>
+        <w:t>All three amounts are equal.</w:t>
+      </w:r>
+    </w:p>
+    <w:p>
+      <w:r>
+        <w:rPr>
+          <w:b/>
+          <w:bCs/>
+        </w:rPr>
+        <w:t>Result: PASS</w:t>
+      </w:r>
+    </w:p>
+    <w:p>
+      <w:r>
+        <w:pict w14:anchorId="5171926E">
+          <v:rect id="_x0000_i1030" style="width:0;height:1.5pt" o:hralign="center" o:hrstd="t" o:hr="t" fillcolor="#a0a0a0" stroked="f"/>
+        </w:pict>
+      </w:r>
+    </w:p>
+    <w:p>
+      <w:pPr>
+        <w:rPr>
+          <w:b/>
+          <w:bCs/>
+        </w:rPr>
+      </w:pPr>
+      <w:r>
+        <w:rPr>
+          <w:b/>
+          <w:bCs/>
+        </w:rPr>
+        <w:t>Count Match</w:t>
+      </w:r>
+    </w:p>
+    <w:p>
+      <w:r>
+        <w:t>The number of unique due transactions equals the Financial Transaction row count, and the number of fee-head lines equals the Financial Transaction Detail row count.</w:t>
+      </w:r>
+    </w:p>
+    <w:p>
+      <w:pPr>
+        <w:rPr>
+          <w:b/>
+          <w:bCs/>
+        </w:rPr>
+      </w:pPr>
+      <w:r>
+        <w:rPr>
+          <w:b/>
+          <w:bCs/>
+        </w:rPr>
+        <w:t>1. Number of Unique Due Transactions</w:t>
+      </w:r>
+    </w:p>
+    <w:p>
+      <w:r>
+        <w:rPr>
+          <w:b/>
+          <w:bCs/>
+        </w:rPr>
+        <w:t>Query:</w:t>
+      </w:r>
+    </w:p>
+    <w:p>
+      <w:r>
+        <w:t>SELECT COUNT(DISTINCT voucher_no) AS unique_due_transactions</w:t>
+      </w:r>
+      <w:r>
+        <w:t xml:space="preserve"> </w:t>
+      </w:r>
+      <w:r>
+        <w:t>FROM staging_ledgers</w:t>
+      </w:r>
+    </w:p>
+    <w:p>
+      <w:r>
+        <w:t>WHERE import_id = (SELECT id</w:t>
+      </w:r>
+      <w:r>
+        <w:t xml:space="preserve"> </w:t>
+      </w:r>
+      <w:r>
+        <w:t>FROM imports</w:t>
+      </w:r>
+      <w:r>
+        <w:t xml:space="preserve"> </w:t>
+      </w:r>
+      <w:r>
+        <w:t>ORDER BY id DESC</w:t>
+      </w:r>
+      <w:r>
+        <w:t xml:space="preserve"> </w:t>
+      </w:r>
+      <w:r>
+        <w:t>LIMIT 1)</w:t>
+      </w:r>
+      <w:r>
+        <w:t xml:space="preserve"> </w:t>
+      </w:r>
+      <w:r>
+        <w:t>AND due_amount &lt;&gt; 0;</w:t>
+      </w:r>
+    </w:p>
+    <w:p>
+      <w:r>
+        <w:rPr>
+          <w:b/>
+          <w:bCs/>
+        </w:rPr>
+        <w:t>Result:</w:t>
+      </w:r>
+    </w:p>
+    <w:p>
+      <w:r>
+        <w:t>unique_due_transactions = 79433</w:t>
+      </w:r>
+    </w:p>
+    <w:p>
+      <w:pPr>
+        <w:rPr>
+          <w:b/>
+          <w:bCs/>
+        </w:rPr>
+      </w:pPr>
+      <w:r>
+        <w:rPr>
+          <w:b/>
+          <w:bCs/>
+        </w:rPr>
+        <w:t>2. Financial Transaction Row Count</w:t>
+      </w:r>
+    </w:p>
+    <w:p>
+      <w:r>
+        <w:rPr>
+          <w:b/>
+          <w:bCs/>
+        </w:rPr>
+        <w:lastRenderedPageBreak/>
+        <w:t>Query:</w:t>
+      </w:r>
+    </w:p>
+    <w:p>
+      <w:r>
+        <w:t>SELECT COUNT(*) AS financial_transaction_count</w:t>
+      </w:r>
+      <w:r>
+        <w:t xml:space="preserve"> </w:t>
+      </w:r>
+      <w:r>
+        <w:t>FROM financial_transactions;</w:t>
+      </w:r>
+    </w:p>
+    <w:p>
+      <w:r>
+        <w:rPr>
+          <w:b/>
+          <w:bCs/>
+        </w:rPr>
+        <w:t>Result:</w:t>
+      </w:r>
+    </w:p>
+    <w:p>
+      <w:r>
+        <w:t>financial_transaction_count = 79433</w:t>
+      </w:r>
+    </w:p>
+    <w:p>
+      <w:pPr>
+        <w:rPr>
+          <w:b/>
+          <w:bCs/>
+        </w:rPr>
+      </w:pPr>
+      <w:r>
+        <w:rPr>
+          <w:b/>
+          <w:bCs/>
+        </w:rPr>
+        <w:t>3. Number of Fee-Head Lines</w:t>
+      </w:r>
+    </w:p>
+    <w:p>
+      <w:r>
+        <w:rPr>
+          <w:b/>
+          <w:bCs/>
+        </w:rPr>
+        <w:t>Query:</w:t>
+      </w:r>
+    </w:p>
+    <w:p>
+      <w:r>
+        <w:t>SELECT COUNT(*) AS fee_head_lines</w:t>
+      </w:r>
+      <w:r>
+        <w:t xml:space="preserve"> </w:t>
+      </w:r>
+      <w:r>
+        <w:t>FROM staging_ledgers</w:t>
+      </w:r>
+      <w:r>
+        <w:t xml:space="preserve"> </w:t>
+      </w:r>
+      <w:r>
         <w:t>WHERE due_amount &lt;&gt; 0;</w:t>
       </w:r>
     </w:p>
     <w:p>
       <w:r>
-        <w:pict w14:anchorId="20499C91">
-          <v:rect id="_x0000_i1063" style="width:0;height:1.5pt" o:hralign="center" o:hrstd="t" o:hr="t" fillcolor="#a0a0a0" stroked="f"/>
-        </w:pict>
-      </w:r>
-    </w:p>
-    <w:p>
-      <w:pPr>
-        <w:rPr>
-          <w:b/>
-          <w:bCs/>
-        </w:rPr>
-      </w:pPr>
-      <w:r>
-        <w:rPr>
-          <w:b/>
-          <w:bCs/>
-        </w:rPr>
-        <w:t>4. Financial Transaction Insertion Logic</w:t>
-      </w:r>
-    </w:p>
-    <w:p>
-      <w:r>
-        <w:t>For each unique due transaction, one record is created in the financial_transactions table.</w:t>
-      </w:r>
-    </w:p>
-    <w:p>
-      <w:r>
-        <w:t>The transaction amount is calculated from the Due Amount of the related staging records.</w:t>
-      </w:r>
-    </w:p>
-    <w:p>
-      <w:r>
-        <w:t>The Financial Transaction insertion logic is implemented in:</w:t>
-      </w:r>
-    </w:p>
-    <w:p>
-      <w:pPr>
-        <w:rPr>
-          <w:u w:val="single"/>
-        </w:rPr>
-      </w:pPr>
-      <w:r>
-        <w:rPr>
-          <w:u w:val="single"/>
-        </w:rPr>
-        <w:t>app/Jobs/ImportLedgerJob.php</w:t>
-      </w:r>
-    </w:p>
-    <w:p>
-      <w:r>
-        <w:t>The parent transaction is created before inserting its related detail records.</w:t>
-      </w:r>
-    </w:p>
-    <w:p>
-      <w:r>
+        <w:rPr>
+          <w:b/>
+          <w:bCs/>
+        </w:rPr>
+        <w:t>Result:</w:t>
+      </w:r>
+    </w:p>
+    <w:p>
+      <w:r>
+        <w:t>fee_head_lines = 93168</w:t>
+      </w:r>
+    </w:p>
+    <w:p>
+      <w:pPr>
+        <w:rPr>
+          <w:b/>
+          <w:bCs/>
+        </w:rPr>
+      </w:pPr>
+      <w:r>
+        <w:rPr>
+          <w:b/>
+          <w:bCs/>
+        </w:rPr>
+        <w:t>4. Financial Transaction Detail Row Count</w:t>
+      </w:r>
+    </w:p>
+    <w:p>
+      <w:r>
+        <w:rPr>
+          <w:b/>
+          <w:bCs/>
+        </w:rPr>
+        <w:t>Query:</w:t>
+      </w:r>
+    </w:p>
+    <w:p>
+      <w:r>
+        <w:t>SELECT COUNT(*) AS financial_transaction_detail_count</w:t>
+      </w:r>
+      <w:r>
+        <w:t xml:space="preserve"> </w:t>
+      </w:r>
+      <w:r>
+        <w:t>FROM financial_transaction_details;</w:t>
+      </w:r>
+    </w:p>
+    <w:p>
+      <w:r>
+        <w:rPr>
+          <w:b/>
+          <w:bCs/>
+        </w:rPr>
+        <w:t>Result:</w:t>
+      </w:r>
+    </w:p>
+    <w:p>
+      <w:r>
+        <w:t>financial_transaction_detail_count = 93168</w:t>
+      </w:r>
+    </w:p>
+    <w:p>
+      <w:pPr>
+        <w:rPr>
+          <w:b/>
+          <w:bCs/>
+        </w:rPr>
+      </w:pPr>
+      <w:r>
+        <w:rPr>
+          <w:b/>
+          <w:bCs/>
+        </w:rPr>
+        <w:t>COUNT MATCH - PASS</w:t>
+      </w:r>
+    </w:p>
+    <w:p>
+      <w:r>
+        <w:t>Unique Due Transactions       79,433</w:t>
+      </w:r>
+    </w:p>
+    <w:p>
+      <w:r>
+        <w:t>Financial Transactions        79,433</w:t>
+      </w:r>
+    </w:p>
+    <w:p>
+      <w:r>
+        <w:t>Fee-Head Lines                93,168</w:t>
+      </w:r>
+    </w:p>
+    <w:p>
+      <w:r>
+        <w:t>Financial Transaction Detail  93,168</w:t>
+      </w:r>
+    </w:p>
+    <w:p>
+      <w:r>
+        <w:t>Both count validations match successfully.</w:t>
+      </w:r>
+      <w:r>
+        <w:t xml:space="preserve"> </w:t>
+      </w:r>
+      <w:r>
+        <w:rPr>
+          <w:b/>
+          <w:bCs/>
+        </w:rPr>
+        <w:t>Result: PASS</w:t>
+      </w:r>
+    </w:p>
+    <w:p>
+      <w:r>
+        <w:rPr>
+          <w:noProof/>
+        </w:rPr>
         <w:lastRenderedPageBreak/>
-        <w:pict w14:anchorId="43083859">
-          <v:rect id="_x0000_i1064" style="width:0;height:1.5pt" o:hralign="center" o:hrstd="t" o:hr="t" fillcolor="#a0a0a0" stroked="f"/>
-        </w:pict>
-      </w:r>
-    </w:p>
-    <w:p>
-      <w:pPr>
-        <w:rPr>
-          <w:b/>
-          <w:bCs/>
-        </w:rPr>
-      </w:pPr>
-      <w:r>
-        <w:rPr>
-          <w:b/>
-          <w:bCs/>
-        </w:rPr>
-        <w:t>5. Financial Transaction Detail Insertion Logic</w:t>
-      </w:r>
-    </w:p>
-    <w:p>
-      <w:r>
-        <w:t>For every fee-head line belonging to a due transaction, one record is created in the financial_transaction_details table.</w:t>
-      </w:r>
-    </w:p>
-    <w:p>
-      <w:r>
-        <w:t>Each detail record is linked to its parent Financial Transaction using:</w:t>
-      </w:r>
-    </w:p>
-    <w:p>
-      <w:r>
-        <w:t>financial_transaction_</w:t>
-      </w:r>
-      <w:proofErr w:type="gramStart"/>
-      <w:r>
-        <w:t>details.financial</w:t>
-      </w:r>
-      <w:proofErr w:type="gramEnd"/>
-      <w:r>
-        <w:t>_tran_id</w:t>
-      </w:r>
-      <w:r>
-        <w:t xml:space="preserve"> -&gt;</w:t>
-      </w:r>
-      <w:r>
-        <w:t>financial_transactions.id</w:t>
-      </w:r>
-    </w:p>
-    <w:p/>
-    <w:p>
-      <w:r>
-        <w:t>The Financial Transaction Detail insertion logic is implemented in:</w:t>
-      </w:r>
-    </w:p>
-    <w:p>
-      <w:pPr>
-        <w:rPr>
-          <w:u w:val="single"/>
-        </w:rPr>
-      </w:pPr>
-      <w:r>
-        <w:rPr>
-          <w:u w:val="single"/>
-        </w:rPr>
-        <w:t>app/Jobs/ImportLedgerJob.php</w:t>
-      </w:r>
-    </w:p>
-    <w:p>
-      <w:r>
-        <w:t>A database transaction is used so that if the parent or any related detail insertion fails, the transaction can be rolled back.</w:t>
-      </w:r>
-    </w:p>
-    <w:p>
-      <w:r>
-        <w:pict w14:anchorId="2D6687B9">
-          <v:rect id="_x0000_i1065" style="width:0;height:1.5pt" o:hralign="center" o:hrstd="t" o:hr="t" fillcolor="#a0a0a0" stroked="f"/>
-        </w:pict>
-      </w:r>
-    </w:p>
-    <w:p>
-      <w:pPr>
-        <w:rPr>
-          <w:b/>
-          <w:bCs/>
-        </w:rPr>
-      </w:pPr>
-      <w:r>
-        <w:rPr>
-          <w:b/>
-          <w:bCs/>
-        </w:rPr>
-        <w:t>6. Amount and Count Validation Queries</w:t>
-      </w:r>
-    </w:p>
-    <w:p>
-      <w:pPr>
-        <w:rPr>
-          <w:b/>
-          <w:bCs/>
-        </w:rPr>
-      </w:pPr>
-      <w:r>
-        <w:rPr>
-          <w:b/>
-          <w:bCs/>
-        </w:rPr>
-        <w:t>Amount Match</w:t>
-      </w:r>
-    </w:p>
-    <w:p>
-      <w:r>
-        <w:t>The total Due Amount in the source file equals the total amount in Financial Transaction, which equals the total amount across Financial Transaction Detail.</w:t>
-      </w:r>
-    </w:p>
-    <w:p>
-      <w:pPr>
-        <w:rPr>
-          <w:b/>
-          <w:bCs/>
-        </w:rPr>
-      </w:pPr>
-      <w:r>
-        <w:rPr>
-          <w:b/>
-          <w:bCs/>
-        </w:rPr>
-        <w:t>1. Total Due Amount</w:t>
-      </w:r>
-    </w:p>
-    <w:p>
-      <w:r>
-        <w:rPr>
-          <w:b/>
-          <w:bCs/>
-        </w:rPr>
-        <w:t>Query:</w:t>
-      </w:r>
-    </w:p>
-    <w:p>
-      <w:r>
-        <w:t xml:space="preserve">SELECT </w:t>
-      </w:r>
-      <w:proofErr w:type="gramStart"/>
-      <w:r>
-        <w:t>SUM(</w:t>
-      </w:r>
-      <w:proofErr w:type="gramEnd"/>
-      <w:r>
-        <w:t>due_amount) AS source_due_amount</w:t>
-      </w:r>
-      <w:r>
-        <w:t xml:space="preserve"> </w:t>
-      </w:r>
-      <w:r>
-        <w:t>FROM staging_ledgers</w:t>
-      </w:r>
-      <w:r>
-        <w:t xml:space="preserve"> </w:t>
-      </w:r>
-      <w:r>
-        <w:t>WHERE due_amount</w:t>
-      </w:r>
-      <w:r>
-        <w:t xml:space="preserve"> </w:t>
-      </w:r>
-      <w:r>
-        <w:t>&lt;&gt; 0;</w:t>
-      </w:r>
-    </w:p>
-    <w:p>
-      <w:r>
-        <w:rPr>
-          <w:b/>
-          <w:bCs/>
-        </w:rPr>
-        <w:t>Result:</w:t>
-      </w:r>
-    </w:p>
-    <w:p>
-      <w:r>
-        <w:t>source_due_amount = 2872660911.00</w:t>
-      </w:r>
-    </w:p>
-    <w:p>
-      <w:pPr>
-        <w:rPr>
-          <w:b/>
-          <w:bCs/>
-        </w:rPr>
-      </w:pPr>
-      <w:r>
-        <w:rPr>
-          <w:b/>
-          <w:bCs/>
-        </w:rPr>
-        <w:t>2. Total Amount from Financial Transaction</w:t>
-      </w:r>
-    </w:p>
-    <w:p>
-      <w:r>
-        <w:rPr>
-          <w:b/>
-          <w:bCs/>
-        </w:rPr>
-        <w:t>Query:</w:t>
-      </w:r>
-    </w:p>
-    <w:p>
-      <w:r>
-        <w:t xml:space="preserve">SELECT </w:t>
-      </w:r>
-      <w:proofErr w:type="gramStart"/>
-      <w:r>
-        <w:t>SUM(</w:t>
-      </w:r>
-      <w:proofErr w:type="gramEnd"/>
-      <w:r>
-        <w:t>amount) AS financial_transaction_amount</w:t>
-      </w:r>
-      <w:r>
-        <w:t xml:space="preserve"> </w:t>
-      </w:r>
-      <w:r>
-        <w:t>FROM financial_transactions;</w:t>
-      </w:r>
-    </w:p>
-    <w:p>
-      <w:r>
-        <w:rPr>
-          <w:b/>
-          <w:bCs/>
-        </w:rPr>
-        <w:t>Result:</w:t>
-      </w:r>
-    </w:p>
-    <w:p>
-      <w:r>
-        <w:t>financial_transaction_amount = 2872660911.00</w:t>
-      </w:r>
-    </w:p>
-    <w:p>
-      <w:pPr>
-        <w:rPr>
-          <w:b/>
-          <w:bCs/>
-        </w:rPr>
-      </w:pPr>
-      <w:r>
-        <w:rPr>
-          <w:b/>
-          <w:bCs/>
+        <w:drawing>
+          <wp:inline distT="0" distB="0" distL="0" distR="0" wp14:anchorId="4926CBCC" wp14:editId="3389A28A">
+            <wp:extent cx="5943600" cy="4580890"/>
+            <wp:effectExtent l="0" t="0" r="0" b="0"/>
+            <wp:docPr id="1173014996" name="Picture 5"/>
+            <wp:cNvGraphicFramePr>
+              <a:graphicFrameLocks xmlns:a="http://schemas.openxmlformats.org/drawingml/2006/main" noChangeAspect="1"/>
+            </wp:cNvGraphicFramePr>
+            <a:graphic xmlns:a="http://schemas.openxmlformats.org/drawingml/2006/main">
+              <a:graphicData uri="http://schemas.openxmlformats.org/drawingml/2006/picture">
+                <pic:pic xmlns:pic="http://schemas.openxmlformats.org/drawingml/2006/picture">
+                  <pic:nvPicPr>
+                    <pic:cNvPr id="0" name="Picture 11"/>
+                    <pic:cNvPicPr>
+                      <a:picLocks noChangeAspect="1" noChangeArrowheads="1"/>
+                    </pic:cNvPicPr>
+                  </pic:nvPicPr>
+                  <pic:blipFill>
+                    <a:blip r:embed="rId6">
+                      <a:extLst>
+                        <a:ext uri="{28A0092B-C50C-407E-A947-70E740481C1C}">
+                          <a14:useLocalDpi xmlns:a14="http://schemas.microsoft.com/office/drawing/2010/main" val="0"/>
+                        </a:ext>
+                      </a:extLst>
+                    </a:blip>
+                    <a:srcRect/>
+                    <a:stretch>
+                      <a:fillRect/>
+                    </a:stretch>
+                  </pic:blipFill>
+                  <pic:spPr bwMode="auto">
+                    <a:xfrm>
+                      <a:off x="0" y="0"/>
+                      <a:ext cx="5943600" cy="4580890"/>
+                    </a:xfrm>
+                    <a:prstGeom prst="rect">
+                      <a:avLst/>
+                    </a:prstGeom>
+                    <a:noFill/>
+                    <a:ln>
+                      <a:noFill/>
+                    </a:ln>
+                  </pic:spPr>
+                </pic:pic>
+              </a:graphicData>
+            </a:graphic>
+          </wp:inline>
+        </w:drawing>
+      </w:r>
+      <w:r>
+        <w:rPr>
+          <w:noProof/>
         </w:rPr>
         <w:lastRenderedPageBreak/>
-        <w:t>3. Total Amount from Financial Transaction Detail</w:t>
-      </w:r>
-    </w:p>
-    <w:p>
-      <w:r>
-        <w:rPr>
-          <w:b/>
-          <w:bCs/>
-        </w:rPr>
-        <w:t>Query:</w:t>
-      </w:r>
-    </w:p>
-    <w:p>
-      <w:r>
-        <w:t xml:space="preserve">SELECT </w:t>
-      </w:r>
-      <w:proofErr w:type="gramStart"/>
-      <w:r>
-        <w:t>SUM(</w:t>
-      </w:r>
-      <w:proofErr w:type="gramEnd"/>
-      <w:r>
-        <w:t>amount) AS financial_transaction_detail_amount</w:t>
-      </w:r>
-      <w:r>
-        <w:t xml:space="preserve"> </w:t>
-      </w:r>
-      <w:r>
-        <w:t>FROM</w:t>
-      </w:r>
-      <w:r>
-        <w:t xml:space="preserve"> </w:t>
-      </w:r>
-      <w:r>
-        <w:t>financial_transaction_details;</w:t>
-      </w:r>
-    </w:p>
-    <w:p>
-      <w:r>
-        <w:rPr>
-          <w:b/>
-          <w:bCs/>
-        </w:rPr>
-        <w:t>Result:</w:t>
-      </w:r>
-    </w:p>
-    <w:p>
-      <w:r>
-        <w:t>financial_transaction_detail_amount = 2872660911.00</w:t>
-      </w:r>
-    </w:p>
-    <w:p>
-      <w:pPr>
-        <w:rPr>
-          <w:b/>
-          <w:bCs/>
-        </w:rPr>
-      </w:pPr>
-      <w:r>
-        <w:rPr>
-          <w:b/>
-          <w:bCs/>
-        </w:rPr>
-        <w:t>AMOUNT MATCH - PASS</w:t>
-      </w:r>
-    </w:p>
-    <w:p>
-      <w:r>
-        <w:t>Source Due Amount                  2,872,660,911.00</w:t>
-      </w:r>
-    </w:p>
-    <w:p>
-      <w:r>
-        <w:t>Financial Transaction Amount       2,872,660,911.00</w:t>
-      </w:r>
-    </w:p>
-    <w:p>
-      <w:r>
-        <w:t>Financial Transaction Detail       2,872,660,911.00</w:t>
-      </w:r>
-    </w:p>
-    <w:p>
-      <w:r>
-        <w:t>All three amounts are equal.</w:t>
-      </w:r>
-    </w:p>
-    <w:p>
-      <w:r>
-        <w:rPr>
-          <w:b/>
-          <w:bCs/>
-        </w:rPr>
-        <w:t>Result: PASS</w:t>
-      </w:r>
-    </w:p>
-    <w:p>
-      <w:r>
-        <w:pict w14:anchorId="5171926E">
-          <v:rect id="_x0000_i1066" style="width:0;height:1.5pt" o:hralign="center" o:hrstd="t" o:hr="t" fillcolor="#a0a0a0" stroked="f"/>
-        </w:pict>
-      </w:r>
-    </w:p>
-    <w:p>
-      <w:pPr>
-        <w:rPr>
-          <w:b/>
-          <w:bCs/>
-        </w:rPr>
-      </w:pPr>
-      <w:r>
-        <w:rPr>
-          <w:b/>
-          <w:bCs/>
-        </w:rPr>
-        <w:t>Count Match</w:t>
-      </w:r>
-    </w:p>
-    <w:p>
-      <w:r>
-        <w:t>The number of unique due transactions equals the Financial Transaction row count, and the number of fee-head lines equals the Financial Transaction Detail row count.</w:t>
-      </w:r>
-    </w:p>
-    <w:p>
-      <w:pPr>
-        <w:rPr>
-          <w:b/>
-          <w:bCs/>
-        </w:rPr>
-      </w:pPr>
-      <w:r>
-        <w:rPr>
-          <w:b/>
-          <w:bCs/>
-        </w:rPr>
-        <w:t>1. Number of Unique Due Transactions</w:t>
-      </w:r>
-    </w:p>
-    <w:p>
-      <w:r>
-        <w:rPr>
-          <w:b/>
-          <w:bCs/>
-        </w:rPr>
-        <w:t>Query:</w:t>
-      </w:r>
-    </w:p>
-    <w:p>
-      <w:r>
-        <w:t xml:space="preserve">SELECT </w:t>
-      </w:r>
-      <w:proofErr w:type="gramStart"/>
-      <w:r>
-        <w:t>COUNT(</w:t>
-      </w:r>
-      <w:proofErr w:type="gramEnd"/>
-      <w:r>
-        <w:t>DISTINCT voucher_no) AS unique_due_transactions</w:t>
-      </w:r>
-      <w:r>
-        <w:t xml:space="preserve"> </w:t>
-      </w:r>
-      <w:r>
-        <w:t>FROM staging_ledgers</w:t>
-      </w:r>
-    </w:p>
-    <w:p>
-      <w:r>
-        <w:t>WHERE import_id = (SELECT id</w:t>
-      </w:r>
-      <w:r>
-        <w:t xml:space="preserve"> </w:t>
-      </w:r>
-      <w:r>
-        <w:t>FROM imports</w:t>
-      </w:r>
-      <w:r>
-        <w:t xml:space="preserve"> </w:t>
-      </w:r>
-      <w:r>
-        <w:t>ORDER BY id DESC</w:t>
-      </w:r>
-      <w:r>
-        <w:t xml:space="preserve"> </w:t>
-      </w:r>
-      <w:r>
-        <w:t>LIMIT 1)</w:t>
-      </w:r>
-      <w:r>
-        <w:t xml:space="preserve"> </w:t>
-      </w:r>
-      <w:r>
-        <w:t>AND due_amount &lt;&gt; 0;</w:t>
-      </w:r>
-    </w:p>
-    <w:p>
-      <w:r>
-        <w:rPr>
-          <w:b/>
-          <w:bCs/>
-        </w:rPr>
-        <w:t>Result:</w:t>
-      </w:r>
-    </w:p>
-    <w:p>
-      <w:r>
-        <w:t>unique_due_transactions = 79433</w:t>
-      </w:r>
-    </w:p>
-    <w:p>
-      <w:pPr>
-        <w:rPr>
-          <w:b/>
-          <w:bCs/>
-        </w:rPr>
-      </w:pPr>
-      <w:r>
-        <w:rPr>
-          <w:b/>
-          <w:bCs/>
-        </w:rPr>
-        <w:t>2. Financial Transaction Row Count</w:t>
-      </w:r>
-    </w:p>
-    <w:p>
-      <w:r>
-        <w:rPr>
-          <w:b/>
-          <w:bCs/>
-        </w:rPr>
-        <w:t>Query:</w:t>
-      </w:r>
-    </w:p>
-    <w:p>
-      <w:r>
-        <w:t xml:space="preserve">SELECT </w:t>
-      </w:r>
-      <w:proofErr w:type="gramStart"/>
-      <w:r>
-        <w:t>COUNT(</w:t>
-      </w:r>
-      <w:proofErr w:type="gramEnd"/>
-      <w:r>
-        <w:t>*) AS financial_transaction_count</w:t>
-      </w:r>
-      <w:r>
-        <w:t xml:space="preserve"> </w:t>
-      </w:r>
-      <w:r>
-        <w:t>FROM financial_transactions;</w:t>
-      </w:r>
-    </w:p>
-    <w:p>
-      <w:r>
-        <w:rPr>
-          <w:b/>
-          <w:bCs/>
-        </w:rPr>
-        <w:t>Result:</w:t>
-      </w:r>
-    </w:p>
-    <w:p>
-      <w:r>
+        <w:drawing>
+          <wp:inline distT="0" distB="0" distL="0" distR="0" wp14:anchorId="70653908" wp14:editId="1B4B027C">
+            <wp:extent cx="5943600" cy="4945380"/>
+            <wp:effectExtent l="0" t="0" r="0" b="7620"/>
+            <wp:docPr id="175004228" name="Picture 4"/>
+            <wp:cNvGraphicFramePr>
+              <a:graphicFrameLocks xmlns:a="http://schemas.openxmlformats.org/drawingml/2006/main" noChangeAspect="1"/>
+            </wp:cNvGraphicFramePr>
+            <a:graphic xmlns:a="http://schemas.openxmlformats.org/drawingml/2006/main">
+              <a:graphicData uri="http://schemas.openxmlformats.org/drawingml/2006/picture">
+                <pic:pic xmlns:pic="http://schemas.openxmlformats.org/drawingml/2006/picture">
+                  <pic:nvPicPr>
+                    <pic:cNvPr id="0" name="Picture 10"/>
+                    <pic:cNvPicPr>
+                      <a:picLocks noChangeAspect="1" noChangeArrowheads="1"/>
+                    </pic:cNvPicPr>
+                  </pic:nvPicPr>
+                  <pic:blipFill>
+                    <a:blip r:embed="rId7">
+                      <a:extLst>
+                        <a:ext uri="{28A0092B-C50C-407E-A947-70E740481C1C}">
+                          <a14:useLocalDpi xmlns:a14="http://schemas.microsoft.com/office/drawing/2010/main" val="0"/>
+                        </a:ext>
+                      </a:extLst>
+                    </a:blip>
+                    <a:srcRect/>
+                    <a:stretch>
+                      <a:fillRect/>
+                    </a:stretch>
+                  </pic:blipFill>
+                  <pic:spPr bwMode="auto">
+                    <a:xfrm>
+                      <a:off x="0" y="0"/>
+                      <a:ext cx="5943600" cy="4945380"/>
+                    </a:xfrm>
+                    <a:prstGeom prst="rect">
+                      <a:avLst/>
+                    </a:prstGeom>
+                    <a:noFill/>
+                    <a:ln>
+                      <a:noFill/>
+                    </a:ln>
+                  </pic:spPr>
+                </pic:pic>
+              </a:graphicData>
+            </a:graphic>
+          </wp:inline>
+        </w:drawing>
+      </w:r>
+      <w:r>
+        <w:rPr>
+          <w:noProof/>
+        </w:rPr>
         <w:lastRenderedPageBreak/>
-        <w:t>financial_transaction_count = 79433</w:t>
-      </w:r>
-    </w:p>
-    <w:p>
-      <w:pPr>
-        <w:rPr>
-          <w:b/>
-          <w:bCs/>
-        </w:rPr>
-      </w:pPr>
-      <w:r>
-        <w:rPr>
-          <w:b/>
-          <w:bCs/>
-        </w:rPr>
-        <w:t>3. Number of Fee-Head Lines</w:t>
-      </w:r>
-    </w:p>
-    <w:p>
-      <w:r>
-        <w:rPr>
-          <w:b/>
-          <w:bCs/>
-        </w:rPr>
-        <w:t>Query:</w:t>
-      </w:r>
-    </w:p>
-    <w:p>
-      <w:r>
-        <w:t xml:space="preserve">SELECT </w:t>
-      </w:r>
-      <w:proofErr w:type="gramStart"/>
-      <w:r>
-        <w:t>COUNT(</w:t>
-      </w:r>
-      <w:proofErr w:type="gramEnd"/>
-      <w:r>
-        <w:t>*) AS fee_head_lines</w:t>
-      </w:r>
-      <w:r>
-        <w:t xml:space="preserve"> </w:t>
-      </w:r>
-      <w:r>
-        <w:t>FROM staging_ledgers</w:t>
-      </w:r>
-      <w:r>
-        <w:t xml:space="preserve"> </w:t>
-      </w:r>
-      <w:r>
-        <w:t>WHERE due_amount &lt;&gt; 0;</w:t>
-      </w:r>
-    </w:p>
-    <w:p>
-      <w:r>
-        <w:rPr>
-          <w:b/>
-          <w:bCs/>
-        </w:rPr>
-        <w:t>Result:</w:t>
-      </w:r>
-    </w:p>
-    <w:p>
-      <w:r>
-        <w:t>fee_head_lines = 93168</w:t>
-      </w:r>
-    </w:p>
-    <w:p>
-      <w:pPr>
-        <w:rPr>
-          <w:b/>
-          <w:bCs/>
-        </w:rPr>
-      </w:pPr>
-      <w:r>
-        <w:rPr>
-          <w:b/>
-          <w:bCs/>
-        </w:rPr>
-        <w:t>4. Financial Transaction Detail Row Count</w:t>
-      </w:r>
-    </w:p>
-    <w:p>
-      <w:r>
-        <w:rPr>
-          <w:b/>
-          <w:bCs/>
-        </w:rPr>
-        <w:t>Query:</w:t>
-      </w:r>
-    </w:p>
-    <w:p>
-      <w:r>
-        <w:t xml:space="preserve">SELECT </w:t>
-      </w:r>
-      <w:proofErr w:type="gramStart"/>
-      <w:r>
-        <w:t>COUNT(</w:t>
-      </w:r>
-      <w:proofErr w:type="gramEnd"/>
-      <w:r>
-        <w:t>*) AS financial_transaction_detail_count</w:t>
-      </w:r>
-      <w:r>
-        <w:t xml:space="preserve"> </w:t>
-      </w:r>
-      <w:r>
-        <w:t>FROM financial_transaction_details;</w:t>
-      </w:r>
-    </w:p>
-    <w:p>
-      <w:r>
-        <w:rPr>
-          <w:b/>
-          <w:bCs/>
-        </w:rPr>
-        <w:t>Result:</w:t>
-      </w:r>
-    </w:p>
-    <w:p>
-      <w:r>
-        <w:t>financial_transaction_detail_count = 93168</w:t>
-      </w:r>
-    </w:p>
-    <w:p>
-      <w:pPr>
-        <w:rPr>
-          <w:b/>
-          <w:bCs/>
-        </w:rPr>
-      </w:pPr>
-      <w:r>
-        <w:rPr>
-          <w:b/>
-          <w:bCs/>
-        </w:rPr>
-        <w:t>COUNT MATCH - PASS</w:t>
-      </w:r>
-    </w:p>
-    <w:p>
-      <w:r>
-        <w:t>Unique Due Transactions       79,433</w:t>
-      </w:r>
-    </w:p>
-    <w:p>
-      <w:r>
-        <w:t>Financial Transactions        79,433</w:t>
-      </w:r>
-    </w:p>
-    <w:p>
-      <w:r>
-        <w:t>Fee-Head Lines                93,168</w:t>
-      </w:r>
-    </w:p>
-    <w:p>
-      <w:r>
-        <w:t xml:space="preserve">Financial Transaction </w:t>
-      </w:r>
-      <w:proofErr w:type="gramStart"/>
-      <w:r>
-        <w:t>Detail  93,168</w:t>
-      </w:r>
-      <w:proofErr w:type="gramEnd"/>
-    </w:p>
-    <w:p>
-      <w:r>
-        <w:t>Both count validations match successfully.</w:t>
-      </w:r>
-      <w:r>
-        <w:t xml:space="preserve"> </w:t>
-      </w:r>
-      <w:r>
-        <w:rPr>
-          <w:b/>
-          <w:bCs/>
-        </w:rPr>
-        <w:t>Result: PASS</w:t>
-      </w:r>
-    </w:p>
-    <w:p/>
+        <w:drawing>
+          <wp:inline distT="0" distB="0" distL="0" distR="0" wp14:anchorId="7649E5A2" wp14:editId="5068C501">
+            <wp:extent cx="5943600" cy="4820920"/>
+            <wp:effectExtent l="0" t="0" r="0" b="0"/>
+            <wp:docPr id="512722686" name="Picture 3"/>
+            <wp:cNvGraphicFramePr>
+              <a:graphicFrameLocks xmlns:a="http://schemas.openxmlformats.org/drawingml/2006/main" noChangeAspect="1"/>
+            </wp:cNvGraphicFramePr>
+            <a:graphic xmlns:a="http://schemas.openxmlformats.org/drawingml/2006/main">
+              <a:graphicData uri="http://schemas.openxmlformats.org/drawingml/2006/picture">
+                <pic:pic xmlns:pic="http://schemas.openxmlformats.org/drawingml/2006/picture">
+                  <pic:nvPicPr>
+                    <pic:cNvPr id="0" name="Picture 9"/>
+                    <pic:cNvPicPr>
+                      <a:picLocks noChangeAspect="1" noChangeArrowheads="1"/>
+                    </pic:cNvPicPr>
+                  </pic:nvPicPr>
+                  <pic:blipFill>
+                    <a:blip r:embed="rId8">
+                      <a:extLst>
+                        <a:ext uri="{28A0092B-C50C-407E-A947-70E740481C1C}">
+                          <a14:useLocalDpi xmlns:a14="http://schemas.microsoft.com/office/drawing/2010/main" val="0"/>
+                        </a:ext>
+                      </a:extLst>
+                    </a:blip>
+                    <a:srcRect/>
+                    <a:stretch>
+                      <a:fillRect/>
+                    </a:stretch>
+                  </pic:blipFill>
+                  <pic:spPr bwMode="auto">
+                    <a:xfrm>
+                      <a:off x="0" y="0"/>
+                      <a:ext cx="5943600" cy="4820920"/>
+                    </a:xfrm>
+                    <a:prstGeom prst="rect">
+                      <a:avLst/>
+                    </a:prstGeom>
+                    <a:noFill/>
+                    <a:ln>
+                      <a:noFill/>
+                    </a:ln>
+                  </pic:spPr>
+                </pic:pic>
+              </a:graphicData>
+            </a:graphic>
+          </wp:inline>
+        </w:drawing>
+      </w:r>
+      <w:r>
+        <w:rPr>
+          <w:noProof/>
+        </w:rPr>
+        <w:drawing>
+          <wp:inline distT="0" distB="0" distL="0" distR="0" wp14:anchorId="0BFB7044" wp14:editId="39EA0F0F">
+            <wp:extent cx="5943600" cy="2470150"/>
+            <wp:effectExtent l="0" t="0" r="0" b="6350"/>
+            <wp:docPr id="1901869645" name="Picture 2"/>
+            <wp:cNvGraphicFramePr>
+              <a:graphicFrameLocks xmlns:a="http://schemas.openxmlformats.org/drawingml/2006/main" noChangeAspect="1"/>
+            </wp:cNvGraphicFramePr>
+            <a:graphic xmlns:a="http://schemas.openxmlformats.org/drawingml/2006/main">
+              <a:graphicData uri="http://schemas.openxmlformats.org/drawingml/2006/picture">
+                <pic:pic xmlns:pic="http://schemas.openxmlformats.org/drawingml/2006/picture">
+                  <pic:nvPicPr>
+                    <pic:cNvPr id="0" name="Picture 8"/>
+                    <pic:cNvPicPr>
+                      <a:picLocks noChangeAspect="1" noChangeArrowheads="1"/>
+                    </pic:cNvPicPr>
+                  </pic:nvPicPr>
+                  <pic:blipFill>
+                    <a:blip r:embed="rId9">
+                      <a:extLst>
+                        <a:ext uri="{28A0092B-C50C-407E-A947-70E740481C1C}">
+                          <a14:useLocalDpi xmlns:a14="http://schemas.microsoft.com/office/drawing/2010/main" val="0"/>
+                        </a:ext>
+                      </a:extLst>
+                    </a:blip>
+                    <a:srcRect/>
+                    <a:stretch>
+                      <a:fillRect/>
+                    </a:stretch>
+                  </pic:blipFill>
+                  <pic:spPr bwMode="auto">
+                    <a:xfrm>
+                      <a:off x="0" y="0"/>
+                      <a:ext cx="5943600" cy="2470150"/>
+                    </a:xfrm>
+                    <a:prstGeom prst="rect">
+                      <a:avLst/>
+                    </a:prstGeom>
+                    <a:noFill/>
+                    <a:ln>
+                      <a:noFill/>
+                    </a:ln>
+                  </pic:spPr>
+                </pic:pic>
+              </a:graphicData>
+            </a:graphic>
+          </wp:inline>
+        </w:drawing>
+      </w:r>
+      <w:r>
+        <w:rPr>
+          <w:noProof/>
+        </w:rPr>
+        <w:lastRenderedPageBreak/>
+        <w:drawing>
+          <wp:inline distT="0" distB="0" distL="0" distR="0" wp14:anchorId="480E9048" wp14:editId="507C2807">
+            <wp:extent cx="5943600" cy="4611370"/>
+            <wp:effectExtent l="0" t="0" r="0" b="0"/>
+            <wp:docPr id="2029343049" name="Picture 1"/>
+            <wp:cNvGraphicFramePr>
+              <a:graphicFrameLocks xmlns:a="http://schemas.openxmlformats.org/drawingml/2006/main" noChangeAspect="1"/>
+            </wp:cNvGraphicFramePr>
+            <a:graphic xmlns:a="http://schemas.openxmlformats.org/drawingml/2006/main">
+              <a:graphicData uri="http://schemas.openxmlformats.org/drawingml/2006/picture">
+                <pic:pic xmlns:pic="http://schemas.openxmlformats.org/drawingml/2006/picture">
+                  <pic:nvPicPr>
+                    <pic:cNvPr id="0" name="Picture 7"/>
+                    <pic:cNvPicPr>
+                      <a:picLocks noChangeAspect="1" noChangeArrowheads="1"/>
+                    </pic:cNvPicPr>
+                  </pic:nvPicPr>
+                  <pic:blipFill>
+                    <a:blip r:embed="rId10">
+                      <a:extLst>
+                        <a:ext uri="{28A0092B-C50C-407E-A947-70E740481C1C}">
+                          <a14:useLocalDpi xmlns:a14="http://schemas.microsoft.com/office/drawing/2010/main" val="0"/>
+                        </a:ext>
+                      </a:extLst>
+                    </a:blip>
+                    <a:srcRect/>
+                    <a:stretch>
+                      <a:fillRect/>
+                    </a:stretch>
+                  </pic:blipFill>
+                  <pic:spPr bwMode="auto">
+                    <a:xfrm>
+                      <a:off x="0" y="0"/>
+                      <a:ext cx="5943600" cy="4611370"/>
+                    </a:xfrm>
+                    <a:prstGeom prst="rect">
+                      <a:avLst/>
+                    </a:prstGeom>
+                    <a:noFill/>
+                    <a:ln>
+                      <a:noFill/>
+                    </a:ln>
+                  </pic:spPr>
+                </pic:pic>
+              </a:graphicData>
+            </a:graphic>
+          </wp:inline>
+        </w:drawing>
+      </w:r>
+    </w:p>
     <w:sectPr>
       <w:pgSz w:w="12240" w:h="15840"/>
       <w:pgMar w:top="1440" w:right="1440" w:bottom="1440" w:left="1440" w:header="720" w:footer="720" w:gutter="0"/>
@@ -1987,6 +2187,7 @@
   <w:style w:type="character" w:default="1" w:styleId="DefaultParagraphFont">
     <w:name w:val="Default Paragraph Font"/>
     <w:uiPriority w:val="1"/>
+    <w:semiHidden/>
     <w:unhideWhenUsed/>
   </w:style>
   <w:style w:type="table" w:default="1" w:styleId="TableNormal">
@@ -2298,6 +2499,29 @@
       <w:smallCaps/>
       <w:color w:val="2F5496" w:themeColor="accent1" w:themeShade="BF"/>
       <w:spacing w:val="5"/>
+    </w:rPr>
+  </w:style>
+  <w:style w:type="character" w:styleId="Hyperlink">
+    <w:name w:val="Hyperlink"/>
+    <w:basedOn w:val="DefaultParagraphFont"/>
+    <w:uiPriority w:val="99"/>
+    <w:unhideWhenUsed/>
+    <w:rsid w:val="006B5E5A"/>
+    <w:rPr>
+      <w:color w:val="0563C1" w:themeColor="hyperlink"/>
+      <w:u w:val="single"/>
+    </w:rPr>
+  </w:style>
+  <w:style w:type="character" w:styleId="UnresolvedMention">
+    <w:name w:val="Unresolved Mention"/>
+    <w:basedOn w:val="DefaultParagraphFont"/>
+    <w:uiPriority w:val="99"/>
+    <w:semiHidden/>
+    <w:unhideWhenUsed/>
+    <w:rsid w:val="006B5E5A"/>
+    <w:rPr>
+      <w:color w:val="605E5C"/>
+      <w:shd w:val="clear" w:color="auto" w:fill="E1DFDD"/>
     </w:rPr>
   </w:style>
 </w:styles>

</xml_diff>